<commit_message>
QA EXUS: Excel propio por grafica de estatus y se quita el reporte Pop Up por Serial
- Estatus por producto financiado ahora exporta su propio archivo (estatus_por_financiado.xlsx) con hoja Resumen (matriz financiado/no financiado) y hoja Detalle; antes descargaba el mismo Excel que la grafica de dona.
- Estatus de inhabilitacion pasa a hoja Resumen (habilitados/inhabilitados y %) + hoja Detalle.
- Nuevo endpoint GET /api/dashboard/export/estatus-financiado/ respetando los filtros globales.
- Se elimina la tarjeta 'Mensajeria Pop Up por Serial' de reportes descargables (boton sin accion, no existia endpoint).

Co-Authored-By: Claude Opus 5 <noreply@anthropic.com>
</commit_message>
<xml_diff>
--- a/Manual_de_uso_Locking_System_v3.docx
+++ b/Manual_de_uso_Locking_System_v3.docx
@@ -54,41 +54,7 @@
         <w:rPr>
           <w:noProof/>
         </w:rPr>
-        <w:drawing>
-          <wp:inline distT="0" distB="0" distL="0" distR="0" wp14:anchorId="22DCD7A6" wp14:editId="0D49B71A">
-            <wp:extent cx="5760720" cy="3600450"/>
-            <wp:effectExtent l="0" t="0" r="0" b="0"/>
-            <wp:docPr id="1" name="Picture 1"/>
-            <wp:cNvGraphicFramePr>
-              <a:graphicFrameLocks xmlns:a="http://schemas.openxmlformats.org/drawingml/2006/main" noChangeAspect="1"/>
-            </wp:cNvGraphicFramePr>
-            <a:graphic xmlns:a="http://schemas.openxmlformats.org/drawingml/2006/main">
-              <a:graphicData uri="http://schemas.openxmlformats.org/drawingml/2006/picture">
-                <pic:pic xmlns:pic="http://schemas.openxmlformats.org/drawingml/2006/picture">
-                  <pic:nvPicPr>
-                    <pic:cNvPr id="0" name="01_login.png"/>
-                    <pic:cNvPicPr/>
-                  </pic:nvPicPr>
-                  <pic:blipFill>
-                    <a:blip r:embed="rId6"/>
-                    <a:stretch>
-                      <a:fillRect/>
-                    </a:stretch>
-                  </pic:blipFill>
-                  <pic:spPr>
-                    <a:xfrm>
-                      <a:off x="0" y="0"/>
-                      <a:ext cx="5760720" cy="3600450"/>
-                    </a:xfrm>
-                    <a:prstGeom prst="rect">
-                      <a:avLst/>
-                    </a:prstGeom>
-                  </pic:spPr>
-                </pic:pic>
-              </a:graphicData>
-            </a:graphic>
-          </wp:inline>
-        </w:drawing>
+        <w:t>Actualizado: 18 de agosto de 2026</w:t>
       </w:r>
     </w:p>
     <w:p>
@@ -1183,7 +1149,7 @@
         <w:pStyle w:val="Ttulo2"/>
       </w:pPr>
       <w:r>
-        <w:t>Una sola sesión por cuenta</w:t>
+        <w:t>Una sola sesión por cuenta y una sola cuenta por navegador</w:t>
       </w:r>
     </w:p>
     <w:p>
@@ -1220,6 +1186,44 @@
       </w:pPr>
       <w:r>
         <w:t>Pedirle a un Administrador que la cierre desde el módulo Usuarios.</w:t>
+      </w:r>
+    </w:p>
+    <w:p>
+      <w:pPr/>
+      <w:r>
+        <w:t>La regla también funciona al revés: mientras alguien tenga su sesión abierta en un navegador, otra persona no puede entrar con una cuenta distinta en ESE navegador. Si lo intenta, la aplicación se lo impide y le indica con qué cuenta está ocupado, por ejemplo: “Este equipo ya tiene una sesión abierta en Chrome con la cuenta op*****@claro.com. Cierra esa sesión antes de entrar con otra cuenta, o entra desde otro navegador.”. El correo aparece parcialmente oculto a propósito.</w:t>
+      </w:r>
+    </w:p>
+    <w:p>
+      <w:pPr>
+        <w:pStyle w:val="Listaconvietas"/>
+      </w:pPr>
+      <w:r>
+        <w:t>Cambiar de navegador sí funciona: si Chrome está ocupado, puedes entrar con otra cuenta desde Edge o Firefox en ese mismo equipo.</w:t>
+      </w:r>
+    </w:p>
+    <w:p>
+      <w:pPr>
+        <w:pStyle w:val="Listaconvietas"/>
+      </w:pPr>
+      <w:r>
+        <w:t>Abrir otra pestaña, otra ventana o incluso otro perfil del mismo navegador no sirve para saltarse el bloqueo: para la aplicación sigue siendo el mismo navegador.</w:t>
+      </w:r>
+    </w:p>
+    <w:p>
+      <w:pPr>
+        <w:pStyle w:val="Listaconvietas"/>
+      </w:pPr>
+      <w:r>
+        <w:t>El navegador queda libre en cuanto la persona que lo ocupa cierra sesión, cuando su sesión caduca por inactividad, o cuando un Administrador la cierra desde el módulo Usuarios.</w:t>
+      </w:r>
+    </w:p>
+    <w:p>
+      <w:pPr>
+        <w:pStyle w:val="Listaconvietas"/>
+      </w:pPr>
+      <w:r>
+        <w:t>Si en tu oficina varios equipos salen a internet por la misma conexión, pueden verse como uno solo. Si te aparece este aviso y nadie más está usando tu equipo, avísale al Administrador para que revise las sesiones abiertas.</w:t>
       </w:r>
     </w:p>
     <w:tbl>
@@ -4545,6 +4549,20 @@
         <w:t>Si el televisor ya está en el estado que elegiste, el botón se deshabilita y te avisa: “El televisor ya está habilitado / inhabilitado”.</w:t>
       </w:r>
     </w:p>
+    <w:p>
+      <w:pPr>
+        <w:spacing w:after="120"/>
+        <w:rPr>
+          <w:lang w:val="es-CO"/>
+        </w:rPr>
+      </w:pPr>
+      <w:r>
+        <w:rPr>
+          <w:lang w:val="es-CO"/>
+        </w:rPr>
+        <w:t>Ten en cuenta que el cambio no se ve de inmediato en el televisor. El fabricante indica que la habilitación y la inhabilitación pueden tardar hasta 15 minutos en aplicarse en el equipo, contados desde que la aplicación envía la orden. Que la sincronización termine con Resultado “OK” quiere decir que la orden se envió correctamente, no que el televisor ya haya cambiado: si el equipo todavía se ve igual, espera ese tiempo antes de volver a intentarlo. Estos 15 minutos son del televisor y no tienen ninguna relación con los 15 minutos de cierre de sesión por inactividad.</w:t>
+      </w:r>
+    </w:p>
     <w:tbl>
       <w:tblPr>
         <w:tblW w:w="0" w:type="auto"/>
@@ -5707,6 +5725,21 @@
         <w:t>Al terminar, un botón “Exportar Excel” con el detalle de esa sincronización.</w:t>
       </w:r>
     </w:p>
+    <w:p>
+      <w:pPr>
+        <w:pStyle w:val="Listaconvietas"/>
+        <w:spacing w:after="60"/>
+        <w:rPr>
+          <w:lang w:val="es-CO"/>
+        </w:rPr>
+      </w:pPr>
+      <w:r>
+        <w:rPr>
+          <w:lang w:val="es-CO"/>
+        </w:rPr>
+        <w:t>Aunque la sincronización termine, cada televisor puede tardar hasta 15 minutos en quedar habilitado o inhabilitado, según lo indicado por el fabricante.</w:t>
+      </w:r>
+    </w:p>
     <w:tbl>
       <w:tblPr>
         <w:tblW w:w="0" w:type="auto"/>
@@ -5870,6 +5903,20 @@
           <w:lang w:val="es-CO"/>
         </w:rPr>
         <w:t>el estado real es distinto al de la aplicación. En ese caso, entra a “Estado” y vuelve a guardar el estado correcto.</w:t>
+      </w:r>
+    </w:p>
+    <w:p>
+      <w:pPr>
+        <w:spacing w:after="120"/>
+        <w:rPr>
+          <w:lang w:val="es-CO"/>
+        </w:rPr>
+      </w:pPr>
+      <w:r>
+        <w:rPr>
+          <w:lang w:val="es-CO"/>
+        </w:rPr>
+        <w:t>Si acabas de cambiar un estado, dale al televisor los 15 minutos que indica el fabricante antes de sacar conclusiones de la validación.</w:t>
       </w:r>
     </w:p>
     <w:p>
@@ -7459,6 +7506,13 @@
               </w:rPr>
               <w:t>El nombre de la persona (aparece en el menú y en la auditoría).</w:t>
             </w:r>
+            <w:r>
+              <w:rPr>
+                <w:sz w:val="20"/>
+                <w:lang w:val="es-CO"/>
+              </w:rPr>
+              <w:t xml:space="preserve"> Son obligatorios: no se puede crear ni guardar un usuario dejándolos vacíos.</w:t>
+            </w:r>
           </w:p>
         </w:tc>
       </w:tr>
@@ -7671,7 +7725,7 @@
         <w:rPr>
           <w:lang w:val="es-CO"/>
         </w:rPr>
-        <w:t>Actualiza tu Correo electrónico, tus Nombres y tus Apellidos y presiona “Guardar cambios”.</w:t>
+        <w:t>Actualiza tus Nombres y tus Apellidos y presiona “Guardar cambios”. El Correo electrónico aparece en gris y no se puede cambiar: es el dato con el que inicias sesión. Los Nombres y los Apellidos son obligatorios; si borras uno y presionas “Guardar cambios”, la aplicación no guarda nada y te avisa debajo del campo (“Los apellidos son obligatorios.”). Escribir solo espacios tampoco cuenta como nombre.</w:t>
       </w:r>
     </w:p>
     <w:p>
@@ -7699,7 +7753,7 @@
         <w:rPr>
           <w:lang w:val="es-CO"/>
         </w:rPr>
-        <w:t>Cambia tu contraseña: escribe la Contraseña actual, la Nueva contraseña (mínimo 10 caracteres), repítela en Confirmar contraseña y presiona “Cambiar contraseña”.</w:t>
+        <w:t>Cambia tu contraseña: escribe la Contraseña actual, la Nueva contraseña (mínimo 10 caracteres), repítela en Confirmar contraseña y presiona “Cambiar contraseña”. Los tres campos tienen a la derecha el icono del ojo para mostrar u ocultar lo que escribiste, y ese icono se queda visible aunque salgas del campo. Al cambiar la contraseña se cierran tus demás sesiones por seguridad; la sesión actual se mantiene.</w:t>
       </w:r>
     </w:p>
     <w:p>
@@ -8375,6 +8429,34 @@
         <w:rPr>
           <w:lang w:val="es-CO"/>
         </w:rPr>
+        <w:t>Cambié el estado y el televisor sigue igual.</w:t>
+      </w:r>
+    </w:p>
+    <w:p>
+      <w:pPr>
+        <w:spacing w:after="120"/>
+        <w:rPr>
+          <w:lang w:val="es-CO"/>
+        </w:rPr>
+      </w:pPr>
+      <w:r>
+        <w:rPr>
+          <w:lang w:val="es-CO"/>
+        </w:rPr>
+        <w:t>Es lo esperado durante los primeros minutos: el fabricante indica que la habilitación y la inhabilitación pueden tardar hasta 15 minutos en aplicarse en el televisor. Revisa que la sincronización haya quedado en “OK” y espera ese tiempo. Si pasado ese lapso el equipo sigue igual, usa “Validar” para ver cómo está realmente y, si hay diferencia, vuelve a guardar el estado desde la pantalla “Estado”.</w:t>
+      </w:r>
+    </w:p>
+    <w:p>
+      <w:pPr>
+        <w:pStyle w:val="Ttulo3"/>
+        <w:rPr>
+          <w:lang w:val="es-CO"/>
+        </w:rPr>
+      </w:pPr>
+      <w:r>
+        <w:rPr>
+          <w:lang w:val="es-CO"/>
+        </w:rPr>
         <w:t>No veo el botón “Nuevo” / “Editar” / el menú “Usuarios”.</w:t>
       </w:r>
     </w:p>
@@ -8486,6 +8568,20 @@
       <w:pPr/>
       <w:r>
         <w:t>Tu cuenta quedó abierta en otro navegador o en otro equipo, y solo se permite una sesión a la vez. Cierra sesión allí, espera 15 minutos a que caduque sola, o pídele a un Administrador que la cierre desde Usuarios (ver punto 4).</w:t>
+      </w:r>
+    </w:p>
+    <w:p>
+      <w:pPr>
+        <w:pStyle w:val="Ttulo3"/>
+      </w:pPr>
+      <w:r>
+        <w:t>Me dice que este navegador ya tiene una sesión abierta con otra cuenta.</w:t>
+      </w:r>
+    </w:p>
+    <w:p>
+      <w:pPr/>
+      <w:r>
+        <w:t>Otra persona dejó su sesión abierta en ese navegador, y solo se permite una cuenta por navegador. Pídele que cierre sesión (su nombre, abajo a la izquierda → Cerrar sesión), entra desde otro navegador, o espera a que esa sesión caduque sola por inactividad. Un Administrador también puede cerrarla desde el módulo Usuarios.</w:t>
       </w:r>
     </w:p>
     <w:p>

</xml_diff>